<commit_message>
docs: :memo: update documentation and user consent agreements
- Added new task in TODO list for improving AI prompt based on route distance.
- Updated documentation to include detailed procedures and legal aspects:
  - Introduction of URL for photo upload form and project reference in documents.
  - Clarified data categories: personal data vs. non-revocable work data.
  - Detailed the irrevocable nature of the photo usage rights granted to CAI.
  - Explained the discretionary nature of CAI's decision to publish or remove photos.
  - Outlined data retention policies and Montagna Servizi's obligations upon contract termination.
- Updated consent agreement documents:
  - Specified the irrevocable nature of photo usage rights and CAI's discretion in publication.
  - Enhanced clarity on GDPR rights and the separation of personal data from work data.
  - Added clauses detailing Montagna Servizi's role and commitments upon contract cessation.
</commit_message>
<xml_diff>
--- a/docs/01-flusso-upload-e-proprieta-dato.docx
+++ b/docs/01-flusso-upload-e-proprieta-dato.docx
@@ -152,6 +152,60 @@
               <w:rPr>
                 <w:b/>
               </w:rPr>
+              <w:t xml:space="preserve">URL form di caricamento</w:t>
+            </w:r>
+          </w:p>
+        </w:tc>
+        <w:tc>
+          <w:p>
+            <w:pPr>
+              <w:pStyle w:val="Compact"/>
+              <w:jc w:val="left"/>
+            </w:pPr>
+            <w:r>
+              <w:t xml:space="preserve">https://fotosicai.montagnaservizi.it/upload</w:t>
+            </w:r>
+          </w:p>
+        </w:tc>
+      </w:tr>
+      <w:tr>
+        <w:tc>
+          <w:p>
+            <w:pPr>
+              <w:pStyle w:val="Compact"/>
+              <w:jc w:val="left"/>
+            </w:pPr>
+            <w:r>
+              <w:rPr>
+                <w:b/>
+              </w:rPr>
+              <w:t xml:space="preserve">Riferimento contrattuale</w:t>
+            </w:r>
+          </w:p>
+        </w:tc>
+        <w:tc>
+          <w:p>
+            <w:pPr>
+              <w:pStyle w:val="Compact"/>
+              <w:jc w:val="left"/>
+            </w:pPr>
+            <w:r>
+              <w:t xml:space="preserve">Piano Progetto Sentiero Italia CAI — CIG B165634123 (2024-2026)</w:t>
+            </w:r>
+          </w:p>
+        </w:tc>
+      </w:tr>
+      <w:tr>
+        <w:tc>
+          <w:p>
+            <w:pPr>
+              <w:pStyle w:val="Compact"/>
+              <w:jc w:val="left"/>
+            </w:pPr>
+            <w:r>
+              <w:rPr>
+                <w:b/>
+              </w:rPr>
               <w:t xml:space="preserve">Versione applicazione</w:t>
             </w:r>
           </w:p>
@@ -190,7 +244,7 @@
               <w:jc w:val="left"/>
             </w:pPr>
             <w:r>
-              <w:t xml:space="preserve">2026-05-01</w:t>
+              <w:t xml:space="preserve">2026-05-02</w:t>
             </w:r>
           </w:p>
         </w:tc>
@@ -245,7 +299,19 @@
         <w:pStyle w:val="FirstParagraph"/>
       </w:pPr>
       <w:r>
-        <w:t xml:space="preserve">FotoSICAI è una piattaforma web pubblica realizzata da Montagna Servizi S.C.p.A. nell’ambito dell’incarico ricevuto dal Club Alpino Italiano per la valorizzazione del Sentiero Italia CAI (di seguito</w:t>
+        <w:t xml:space="preserve">FotoSICAI è una piattaforma web pubblica realizzata da Montagna Servizi S.C.p.A. nell’ambito del</w:t>
+      </w:r>
+      <w:r>
+        <w:t xml:space="preserve"> </w:t>
+      </w:r>
+      <w:r>
+        <w:rPr>
+          <w:b/>
+        </w:rPr>
+        <w:t xml:space="preserve">Piano Progetto Sentiero Italia CAI (CIG B165634123, 2024-2026)</w:t>
+      </w:r>
+      <w:r>
+        <w:t xml:space="preserve">, affidato dal Club Alpino Italiano per la valorizzazione del Sentiero Italia CAI (di seguito</w:t>
       </w:r>
       <w:r>
         <w:t xml:space="preserve"> </w:t>
@@ -268,7 +334,19 @@
         <w:pStyle w:val="BodyText"/>
       </w:pPr>
       <w:r>
-        <w:t xml:space="preserve">Le fotografie raccolte sono pubblicate sulla mappa interattiva della piattaforma, indicizzate per regione, provincia, comune e tappa SICAI, e accompagnate da titolo, descrizione e attribuzione dell’autore.</w:t>
+        <w:t xml:space="preserve">Il form di caricamento delle fotografie è accessibile all’indirizzo</w:t>
+      </w:r>
+      <w:r>
+        <w:t xml:space="preserve"> </w:t>
+      </w:r>
+      <w:r>
+        <w:rPr>
+          <w:b/>
+        </w:rPr>
+        <w:t xml:space="preserve">https://fotosicai.montagnaservizi.it/upload</w:t>
+      </w:r>
+      <w:r>
+        <w:t xml:space="preserve">. Le fotografie raccolte sono pubblicate sulla mappa interattiva della piattaforma, indicizzate per regione, provincia, comune e tappa SICAI, e accompagnate da titolo, descrizione e attribuzione dell’autore.</w:t>
       </w:r>
     </w:p>
     <w:p>
@@ -319,7 +397,22 @@
         <w:t xml:space="preserve"> </w:t>
       </w:r>
       <w:r>
-        <w:t xml:space="preserve">Montagna Servizi S.C.p.A., con sede legale in Milano, Via E. Petrella 19 — C.F./P.IVA 11790660960 — PEC montagnaserviziscpa@legalmail.it — email info@montagnaservizi.com. Montagna Servizi opera in qualità di soggetto attuatore per il SICAI e gestisce, per conto del CAI, lo sviluppo, l’hosting, la manutenzione e l’amministrazione tecnica della piattaforma FotoSICAI.</w:t>
+        <w:t xml:space="preserve">Montagna Servizi S.C.p.A., con sede legale in Milano, Via E. Petrella 19 — C.F./P.IVA 11790660960 — PEC montagnaserviziscpa@legalmail.it — email info@montagnaservizi.com. Montagna Servizi opera in qualità di soggetto attuatore per il SICAI nell’ambito del</w:t>
+      </w:r>
+      <w:r>
+        <w:t xml:space="preserve"> </w:t>
+      </w:r>
+      <w:r>
+        <w:rPr>
+          <w:b/>
+        </w:rPr>
+        <w:t xml:space="preserve">Piano Progetto Sentiero Italia CAI (CIG B165634123, 2024-2026)</w:t>
+      </w:r>
+      <w:r>
+        <w:t xml:space="preserve"> </w:t>
+      </w:r>
+      <w:r>
+        <w:t xml:space="preserve">e gestisce, per conto del CAI, lo sviluppo, l’hosting, la manutenzione e l’amministrazione tecnica della piattaforma FotoSICAI per la sola durata del contratto.</w:t>
       </w:r>
     </w:p>
     <w:p>
@@ -353,7 +446,7 @@
         <w:t xml:space="preserve"> </w:t>
       </w:r>
       <w:r>
-        <w:t xml:space="preserve">Il CAI, ai sensi del documento di consenso accettato dall’autore, può mettere le fotografie a disposizione di soggetti terzi (es. Enti Parco, Regioni, partner, testate giornalistiche, enti di promozione turistica) esclusivamente per finalità promozionali, informative o istituzionali legate al SICAI. La licenza pubblica con cui le foto sono rilasciate (CC BY 4.0) consente inoltre il riuso da parte di chiunque, con obbligo di attribuzione.</w:t>
+        <w:t xml:space="preserve">Il CAI, ai sensi del documento di consenso accettato dall’autore, può mettere le fotografie a disposizione di soggetti terzi (a titolo esemplificativo: Enti Parco, Regioni, enti pubblici e privati, partner, sponsor, testate giornalistiche, enti di promozione turistica, case editrici), anche a titolo oneroso, per qualsiasi finalità lecita coerente con la valorizzazione del Sentiero Italia CAI, inclusi gli usi commerciali. La licenza pubblica con cui le foto sono rilasciate (CC BY 4.0) consente inoltre il riuso da parte di chiunque — anche per fini commerciali — con obbligo di attribuzione.</w:t>
       </w:r>
     </w:p>
     <w:p>
@@ -367,9 +460,9 @@
       <w:pPr>
         <w:pStyle w:val="Heading2"/>
       </w:pPr>
-      <w:bookmarkStart w:id="23" w:name="dati-personali-trattati"/>
-      <w:r>
-        <w:t xml:space="preserve">3. Dati personali trattati</w:t>
+      <w:bookmarkStart w:id="23" w:name="dati-trattati"/>
+      <w:r>
+        <w:t xml:space="preserve">3. Dati trattati</w:t>
       </w:r>
       <w:bookmarkEnd w:id="23"/>
     </w:p>
@@ -378,7 +471,37 @@
         <w:pStyle w:val="FirstParagraph"/>
       </w:pPr>
       <w:r>
-        <w:t xml:space="preserve">Sulla piattaforma sono trattati i seguenti dati personali dell’Autore:</w:t>
+        <w:t xml:space="preserve">I dati gestiti dalla piattaforma si articolano su</w:t>
+      </w:r>
+      <w:r>
+        <w:t xml:space="preserve"> </w:t>
+      </w:r>
+      <w:r>
+        <w:rPr>
+          <w:b/>
+        </w:rPr>
+        <w:t xml:space="preserve">due categorie distinte</w:t>
+      </w:r>
+      <w:r>
+        <w:t xml:space="preserve">, che è importante tenere separate sotto il profilo della titolarità e dei diritti dell’interessato.</w:t>
+      </w:r>
+    </w:p>
+    <w:p>
+      <w:pPr>
+        <w:pStyle w:val="Heading3"/>
+      </w:pPr>
+      <w:bookmarkStart w:id="24" w:name="X7be0793dc66085b1b28aa3ff99a8e8b499e3c45"/>
+      <w:r>
+        <w:t xml:space="preserve">3.1 Dati personali dell’Autore (soggetti al GDPR)</w:t>
+      </w:r>
+      <w:bookmarkEnd w:id="24"/>
+    </w:p>
+    <w:p>
+      <w:pPr>
+        <w:pStyle w:val="FirstParagraph"/>
+      </w:pPr>
+      <w:r>
+        <w:t xml:space="preserve">Sono dati personali dell’Autore, trattati dal CAI in qualità di Titolare e da Montagna Servizi in qualità di Responsabile, e su cui l’Autore può sempre esercitare i diritti previsti dagli articoli 15-22 GDPR:</w:t>
       </w:r>
     </w:p>
     <w:p>
@@ -467,10 +590,32 @@
     </w:p>
     <w:p>
       <w:pPr>
+        <w:pStyle w:val="Heading3"/>
+      </w:pPr>
+      <w:bookmarkStart w:id="25" w:name="X5d6e7175dae4b297c75ef515cd8ecd63e3a45b8"/>
+      <w:r>
+        <w:t xml:space="preserve">3.2 Dati delle Opere cedute al CAI (non revocabili)</w:t>
+      </w:r>
+      <w:bookmarkEnd w:id="25"/>
+    </w:p>
+    <w:p>
+      <w:pPr>
         <w:pStyle w:val="FirstParagraph"/>
       </w:pPr>
       <w:r>
-        <w:t xml:space="preserve">Per ciascuna fotografia caricata sono inoltre trattati i seguenti metadati, che possono qualificarsi come dati personali in quanto associati all’Autore:</w:t>
+        <w:t xml:space="preserve">Per ciascuna fotografia caricata sono inoltre trattati i dati che costituiscono</w:t>
+      </w:r>
+      <w:r>
+        <w:t xml:space="preserve"> </w:t>
+      </w:r>
+      <w:r>
+        <w:rPr>
+          <w:b/>
+        </w:rPr>
+        <w:t xml:space="preserve">parte integrante e inscindibile dell’Opera fotografica</w:t>
+      </w:r>
+      <w:r>
+        <w:t xml:space="preserve">:</w:t>
       </w:r>
     </w:p>
     <w:p>
@@ -482,6 +627,18 @@
         <w:pStyle w:val="Compact"/>
       </w:pPr>
       <w:r>
+        <w:t xml:space="preserve">file immagine in tre risoluzioni (originale, media, thumbnail);</w:t>
+      </w:r>
+    </w:p>
+    <w:p>
+      <w:pPr>
+        <w:numPr>
+          <w:ilvl w:val="0"/>
+          <w:numId w:val="1002"/>
+        </w:numPr>
+        <w:pStyle w:val="Compact"/>
+      </w:pPr>
+      <w:r>
         <w:t xml:space="preserve">coordinate GPS (latitudine, longitudine) estratte dai dati EXIF della fotografia o, in subordine, indicate manualmente dall’Autore sulla mappa;</w:t>
       </w:r>
     </w:p>
@@ -518,19 +675,74 @@
         <w:pStyle w:val="Compact"/>
       </w:pPr>
       <w:r>
-        <w:t xml:space="preserve">titolo e descrizione (generati con AI vision e revisionati / modificati dall’autore prima della pubblicazione);</w:t>
-      </w:r>
-    </w:p>
-    <w:p>
-      <w:pPr>
-        <w:numPr>
-          <w:ilvl w:val="0"/>
-          <w:numId w:val="1002"/>
-        </w:numPr>
-        <w:pStyle w:val="Compact"/>
-      </w:pPr>
-      <w:r>
-        <w:t xml:space="preserve">file immagine in tre risoluzioni (originale, media, thumbnail).</w:t>
+        <w:t xml:space="preserve">titolo e descrizione (generati con AI vision e revisionati / modificati dall’Autore prima della pubblicazione).</w:t>
+      </w:r>
+    </w:p>
+    <w:p>
+      <w:pPr>
+        <w:pStyle w:val="FirstParagraph"/>
+      </w:pPr>
+      <w:r>
+        <w:t xml:space="preserve">Questi dati, dal momento dell’accettazione del consenso e della validazione amministrativa della foto,</w:t>
+      </w:r>
+      <w:r>
+        <w:t xml:space="preserve"> </w:t>
+      </w:r>
+      <w:r>
+        <w:rPr>
+          <w:b/>
+        </w:rPr>
+        <w:t xml:space="preserve">non sono qualificabili come dati personali dell’Autore soggetti ai diritti GDPR</w:t>
+      </w:r>
+      <w:r>
+        <w:t xml:space="preserve">: essi sono parte dell’Opera fotografica i cui diritti d’uso sono stati ceduti al Club Alpino Italiano in modo irrevocabile (cfr. § 6 e documento di consenso). Diventano pertanto</w:t>
+      </w:r>
+      <w:r>
+        <w:t xml:space="preserve"> </w:t>
+      </w:r>
+      <w:r>
+        <w:rPr>
+          <w:b/>
+        </w:rPr>
+        <w:t xml:space="preserve">dati di proprietà del CAI</w:t>
+      </w:r>
+      <w:r>
+        <w:t xml:space="preserve">, parte del patrimonio iconografico del Sentiero Italia CAI, e l’Autore non può rivendicarne la cancellazione, la rettifica del posizionamento o il ritiro dalla piattaforma. Resta sempre possibile per l’Autore richiedere l’</w:t>
+      </w:r>
+      <w:r>
+        <w:rPr>
+          <w:b/>
+        </w:rPr>
+        <w:t xml:space="preserve">anonimizzazione dell’attribuzione</w:t>
+      </w:r>
+      <w:r>
+        <w:t xml:space="preserve"> </w:t>
+      </w:r>
+      <w:r>
+        <w:t xml:space="preserve">(sostituzione del proprio nome con dicitura anonima): tale richiesta è esercitata sul piano dei dati personali dell’Autore (§ 3.1) e non incide sull’Opera in sé né sulla sua presenza nel patrimonio CAI.</w:t>
+      </w:r>
+    </w:p>
+    <w:p>
+      <w:pPr>
+        <w:pStyle w:val="BodyText"/>
+      </w:pPr>
+      <w:r>
+        <w:t xml:space="preserve">L’unico canale tramite cui un’Opera può essere rimossa dalla piattaforma è la procedura di</w:t>
+      </w:r>
+      <w:r>
+        <w:t xml:space="preserve"> </w:t>
+      </w:r>
+      <w:r>
+        <w:rPr>
+          <w:b/>
+        </w:rPr>
+        <w:t xml:space="preserve">validazione amministrativa</w:t>
+      </w:r>
+      <w:r>
+        <w:t xml:space="preserve"> </w:t>
+      </w:r>
+      <w:r>
+        <w:t xml:space="preserve">(cfr. § 4.7), oppure una decisione del CAI in qualità di proprietario del patrimonio.</w:t>
       </w:r>
     </w:p>
     <w:p>
@@ -544,11 +756,11 @@
       <w:pPr>
         <w:pStyle w:val="Heading2"/>
       </w:pPr>
-      <w:bookmarkStart w:id="24" w:name="flusso-di-upload"/>
+      <w:bookmarkStart w:id="26" w:name="flusso-di-upload"/>
       <w:r>
         <w:t xml:space="preserve">4. Flusso di upload</w:t>
       </w:r>
-      <w:bookmarkEnd w:id="24"/>
+      <w:bookmarkEnd w:id="26"/>
     </w:p>
     <w:p>
       <w:pPr>
@@ -562,18 +774,30 @@
       <w:pPr>
         <w:pStyle w:val="Heading3"/>
       </w:pPr>
-      <w:bookmarkStart w:id="25" w:name="step-1-selezione-foto-e-dati-anagrafici"/>
+      <w:bookmarkStart w:id="27" w:name="step-1-selezione-foto-e-dati-anagrafici"/>
       <w:r>
         <w:t xml:space="preserve">4.1 Step 1 — Selezione foto e dati anagrafici</w:t>
       </w:r>
-      <w:bookmarkEnd w:id="25"/>
+      <w:bookmarkEnd w:id="27"/>
     </w:p>
     <w:p>
       <w:pPr>
         <w:pStyle w:val="FirstParagraph"/>
       </w:pPr>
       <w:r>
-        <w:t xml:space="preserve">L’Autore accede al form pubblico e seleziona una o più fotografie (anche in modalità batch tramite drag &amp; drop). Il sistema estrae i dati EXIF da ciascuna immagine e classifica ogni foto in tre stati visibili come badge sulle thumbnail:</w:t>
+        <w:t xml:space="preserve">L’Autore accede al form pubblico (URL:</w:t>
+      </w:r>
+      <w:r>
+        <w:t xml:space="preserve"> </w:t>
+      </w:r>
+      <w:r>
+        <w:rPr>
+          <w:rStyle w:val="VerbatimChar"/>
+        </w:rPr>
+        <w:t xml:space="preserve">https://fotosicai.montagnaservizi.it/upload</w:t>
+      </w:r>
+      <w:r>
+        <w:t xml:space="preserve">) e seleziona una o più fotografie (anche in modalità batch tramite drag &amp; drop). Il sistema estrae i dati EXIF da ciascuna immagine e classifica ogni foto in tre stati visibili come badge sulle thumbnail:</w:t>
       </w:r>
     </w:p>
     <w:p>
@@ -651,11 +875,11 @@
       <w:pPr>
         <w:pStyle w:val="Heading3"/>
       </w:pPr>
-      <w:bookmarkStart w:id="26" w:name="Xdb35698dee3f5901323fc97e8e87f1cfa760a9d"/>
+      <w:bookmarkStart w:id="28" w:name="Xdb35698dee3f5901323fc97e8e87f1cfa760a9d"/>
       <w:r>
         <w:t xml:space="preserve">4.2 Step 2 e 3 — Posizionamento e revisione (solo per foto non OK)</w:t>
       </w:r>
-      <w:bookmarkEnd w:id="26"/>
+      <w:bookmarkEnd w:id="28"/>
     </w:p>
     <w:p>
       <w:pPr>
@@ -669,11 +893,11 @@
       <w:pPr>
         <w:pStyle w:val="Heading3"/>
       </w:pPr>
-      <w:bookmarkStart w:id="27" w:name="generazione-ai-di-titolo-e-descrizione"/>
+      <w:bookmarkStart w:id="29" w:name="generazione-ai-di-titolo-e-descrizione"/>
       <w:r>
         <w:t xml:space="preserve">4.3 Generazione AI di titolo e descrizione</w:t>
       </w:r>
-      <w:bookmarkEnd w:id="27"/>
+      <w:bookmarkEnd w:id="29"/>
     </w:p>
     <w:p>
       <w:pPr>
@@ -687,11 +911,11 @@
       <w:pPr>
         <w:pStyle w:val="Heading3"/>
       </w:pPr>
-      <w:bookmarkStart w:id="28" w:name="step-4-riepilogo-e-modifica"/>
+      <w:bookmarkStart w:id="30" w:name="step-4-riepilogo-e-modifica"/>
       <w:r>
         <w:t xml:space="preserve">4.4 Step 4 — Riepilogo e modifica</w:t>
       </w:r>
-      <w:bookmarkEnd w:id="28"/>
+      <w:bookmarkEnd w:id="30"/>
     </w:p>
     <w:p>
       <w:pPr>
@@ -705,11 +929,11 @@
       <w:pPr>
         <w:pStyle w:val="Heading3"/>
       </w:pPr>
-      <w:bookmarkStart w:id="29" w:name="step-5-consenso-e-pubblicazione"/>
+      <w:bookmarkStart w:id="31" w:name="step-5-consenso-e-pubblicazione"/>
       <w:r>
         <w:t xml:space="preserve">4.5 Step 5 — Consenso e pubblicazione</w:t>
       </w:r>
-      <w:bookmarkEnd w:id="29"/>
+      <w:bookmarkEnd w:id="31"/>
     </w:p>
     <w:p>
       <w:pPr>
@@ -806,18 +1030,18 @@
       <w:pPr>
         <w:pStyle w:val="Heading3"/>
       </w:pPr>
-      <w:bookmarkStart w:id="30" w:name="verifica-indirizzo-email"/>
+      <w:bookmarkStart w:id="32" w:name="verifica-indirizzo-email"/>
       <w:r>
         <w:t xml:space="preserve">4.6 Verifica indirizzo email</w:t>
       </w:r>
-      <w:bookmarkEnd w:id="30"/>
+      <w:bookmarkEnd w:id="32"/>
     </w:p>
     <w:p>
       <w:pPr>
         <w:pStyle w:val="FirstParagraph"/>
       </w:pPr>
       <w:r>
-        <w:t xml:space="preserve">Il sistema invia all’Autore una email contenente un link di conferma. Il messaggio riepiloga i dati inseriti, fa riferimento all’incarico di Montagna Servizi per il SICAI ed elenca le foto in attesa di pubblicazione. Il click sul link convalida l’indirizzo email (campo</w:t>
+        <w:t xml:space="preserve">Il sistema invia all’Autore una email contenente un link di conferma. Il messaggio riepiloga i dati inseriti, fa riferimento esplicito al Piano Progetto Sentiero Italia CAI affidato a Montagna Servizi (CIG B165634123, 2024-2026) ed elenca le foto in attesa di pubblicazione. Il click sul link convalida l’indirizzo email (campo</w:t>
       </w:r>
       <w:r>
         <w:t xml:space="preserve"> </w:t>
@@ -839,11 +1063,11 @@
       <w:pPr>
         <w:pStyle w:val="Heading3"/>
       </w:pPr>
-      <w:bookmarkStart w:id="31" w:name="validazione-amministrativa"/>
+      <w:bookmarkStart w:id="33" w:name="validazione-amministrativa"/>
       <w:r>
         <w:t xml:space="preserve">4.7 Validazione amministrativa</w:t>
       </w:r>
-      <w:bookmarkEnd w:id="31"/>
+      <w:bookmarkEnd w:id="33"/>
     </w:p>
     <w:p>
       <w:pPr>
@@ -921,13 +1145,36 @@
     </w:p>
     <w:p>
       <w:pPr>
+        <w:pStyle w:val="BodyText"/>
+      </w:pPr>
+      <w:r>
+        <w:t xml:space="preserve">La validazione è un atto</w:t>
+      </w:r>
+      <w:r>
+        <w:t xml:space="preserve"> </w:t>
+      </w:r>
+      <w:r>
+        <w:rPr>
+          <w:b/>
+        </w:rPr>
+        <w:t xml:space="preserve">discrezionale</w:t>
+      </w:r>
+      <w:r>
+        <w:t xml:space="preserve"> </w:t>
+      </w:r>
+      <w:r>
+        <w:t xml:space="preserve">del CAI (o del soggetto attuatore da esso designato): il CAI non è obbligato a pubblicare le fotografie caricate dall’Autore e può decidere di non validarle, senza obbligo di motivazione e senza che da ciò sorga alcun diritto in capo all’Autore. Anche dopo la validazione e la pubblicazione, il CAI conserva il diritto di rimuovere un’Opera dalla piattaforma in qualsiasi momento, a propria insindacabile discrezione (cfr. § 6.5).</w:t>
+      </w:r>
+    </w:p>
+    <w:p>
+      <w:pPr>
         <w:pStyle w:val="Heading3"/>
       </w:pPr>
-      <w:bookmarkStart w:id="32" w:name="pubblicazione"/>
+      <w:bookmarkStart w:id="34" w:name="pubblicazione"/>
       <w:r>
         <w:t xml:space="preserve">4.8 Pubblicazione</w:t>
       </w:r>
-      <w:bookmarkEnd w:id="32"/>
+      <w:bookmarkEnd w:id="34"/>
     </w:p>
     <w:p>
       <w:pPr>
@@ -1017,11 +1264,11 @@
       <w:pPr>
         <w:pStyle w:val="Heading2"/>
       </w:pPr>
-      <w:bookmarkStart w:id="33" w:name="Xde2716c41d19c679e7537d0c60636402fec94b6"/>
+      <w:bookmarkStart w:id="35" w:name="Xde2716c41d19c679e7537d0c60636402fec94b6"/>
       <w:r>
         <w:t xml:space="preserve">5. Architettura tecnica e localizzazione dei dati</w:t>
       </w:r>
-      <w:bookmarkEnd w:id="33"/>
+      <w:bookmarkEnd w:id="35"/>
     </w:p>
     <w:p>
       <w:pPr>
@@ -1194,21 +1441,21 @@
       <w:pPr>
         <w:pStyle w:val="Heading2"/>
       </w:pPr>
-      <w:bookmarkStart w:id="34" w:name="proprietà-del-dato"/>
+      <w:bookmarkStart w:id="36" w:name="proprietà-del-dato"/>
       <w:r>
         <w:t xml:space="preserve">6. Proprietà del dato</w:t>
       </w:r>
-      <w:bookmarkEnd w:id="34"/>
+      <w:bookmarkEnd w:id="36"/>
     </w:p>
     <w:p>
       <w:pPr>
         <w:pStyle w:val="Heading3"/>
       </w:pPr>
-      <w:bookmarkStart w:id="35" w:name="proprietà-delle-fotografie"/>
+      <w:bookmarkStart w:id="37" w:name="proprietà-delle-fotografie"/>
       <w:r>
         <w:t xml:space="preserve">6.1 Proprietà delle fotografie</w:t>
       </w:r>
-      <w:bookmarkEnd w:id="35"/>
+      <w:bookmarkEnd w:id="37"/>
     </w:p>
     <w:p>
       <w:pPr>
@@ -1239,10 +1486,22 @@
         <w:rPr>
           <w:b/>
         </w:rPr>
-        <w:t xml:space="preserve">licenza d’uso non esclusiva, gratuita, a tempo illimitato e senza limiti territoriali</w:t>
-      </w:r>
-      <w:r>
-        <w:t xml:space="preserve">, e accetta che le fotografie pubblicate sulla piattaforma siano rilasciate al pubblico con licenza</w:t>
+        <w:t xml:space="preserve">licenza d’uso non esclusiva, gratuita, irrevocabile, a tempo illimitato e senza limiti territoriali</w:t>
+      </w:r>
+      <w:r>
+        <w:t xml:space="preserve">, valida per</w:t>
+      </w:r>
+      <w:r>
+        <w:t xml:space="preserve"> </w:t>
+      </w:r>
+      <w:r>
+        <w:rPr>
+          <w:b/>
+        </w:rPr>
+        <w:t xml:space="preserve">qualsiasi finalità lecita, anche di natura commerciale e con scopo di lucro</w:t>
+      </w:r>
+      <w:r>
+        <w:t xml:space="preserve">, in coerenza con la valorizzazione del Sentiero Italia CAI e con la missione del Club Alpino Italiano. La licenza copre tutte le forme di utilizzo, riproduzione, modifica, adattamento, pubblicazione, diffusione, distribuzione e messa a disposizione di soggetti terzi, su qualsiasi mezzo e canale (siti web, social media, applicazioni, riviste, libri, cataloghi, materiali promozionali, mostre, prodotti editoriali, audiovisivi, comunicazione istituzionale e commerciale, ecc.). Le fotografie pubblicate sulla piattaforma sono inoltre rilasciate al pubblico con licenza</w:t>
       </w:r>
       <w:r>
         <w:t xml:space="preserve"> </w:t>
@@ -1254,36 +1513,53 @@
         <w:t xml:space="preserve">Creative Commons Attribution 4.0 International (CC BY 4.0)</w:t>
       </w:r>
       <w:r>
-        <w:t xml:space="preserve">. Il CAI si impegna, ove tecnicamente possibile, a citare il nome dell’Autore.</w:t>
+        <w:t xml:space="preserve">, che consente a chiunque di condividere e adattare le Opere — anche per usi commerciali — con obbligo di attribuzione dell’autore. Il CAI si impegna, ove tecnicamente possibile, a citare il nome dell’Autore.</w:t>
+      </w:r>
+    </w:p>
+    <w:p>
+      <w:pPr>
+        <w:pStyle w:val="BodyText"/>
+      </w:pPr>
+      <w:r>
+        <w:rPr>
+          <w:b/>
+        </w:rPr>
+        <w:t xml:space="preserve">Carattere irrevocabile della concessione.</w:t>
+      </w:r>
+      <w:r>
+        <w:t xml:space="preserve"> </w:t>
+      </w:r>
+      <w:r>
+        <w:t xml:space="preserve">La concessione dei diritti d’uso al CAI è irrevocabile dal momento del caricamento e della validazione: l’Autore non può, in un momento successivo, richiedere al CAI di interrompere l’uso delle Opere già caricate, né rivendicarne l’uso esclusivo o richiedere compensi economici. Tale irrevocabilità è coerente con la natura del progetto FotoSICAI — costruzione di un patrimonio iconografico stabile del Sentiero Italia CAI, valorizzabile anche economicamente per finanziare le attività di tutela e promozione del Sentiero — e con la successiva pubblicazione delle Opere sotto licenza pubblica CC BY 4.0, che è anch’essa per sua natura non revocabile nei confronti dei terzi che hanno acquisito i diritti d’uso.</w:t>
       </w:r>
     </w:p>
     <w:p>
       <w:pPr>
         <w:pStyle w:val="Heading3"/>
       </w:pPr>
-      <w:bookmarkStart w:id="36" w:name="proprietà-del-database-e-dei-metadati"/>
+      <w:bookmarkStart w:id="38" w:name="proprietà-del-database-e-dei-metadati"/>
       <w:r>
         <w:t xml:space="preserve">6.2 Proprietà del database e dei metadati</w:t>
       </w:r>
-      <w:bookmarkEnd w:id="36"/>
+      <w:bookmarkEnd w:id="38"/>
     </w:p>
     <w:p>
       <w:pPr>
         <w:pStyle w:val="FirstParagraph"/>
       </w:pPr>
       <w:r>
-        <w:t xml:space="preserve">Il database FotoSICAI — contenente il catalogo delle fotografie, i metadati associati, l’indicizzazione per tappa SICAI e il legame con il tracciato — è di proprietà del Club Alpino Italiano in qualità di Titolare del progetto. Montagna Servizi ne cura la gestione tecnica in qualità di Responsabile del trattamento. Al termine dell’incarico, Montagna Servizi consegnerà al CAI l’intero patrimonio dati (database e immagini in tutte le risoluzioni) in formato standard riutilizzabile.</w:t>
+        <w:t xml:space="preserve">Il database FotoSICAI — contenente il catalogo delle fotografie, i metadati associati, l’indicizzazione per tappa SICAI e il legame con il tracciato — è di proprietà del Club Alpino Italiano in qualità di Titolare del progetto. Montagna Servizi ne cura la gestione tecnica in qualità di Responsabile del trattamento, limitatamente alla durata del contratto CIG B165634123. Al termine del contratto si applicano gli impegni di consegna, rimozione dei riferimenti e cessazione d’uso descritti al § 9.</w:t>
       </w:r>
     </w:p>
     <w:p>
       <w:pPr>
         <w:pStyle w:val="Heading3"/>
       </w:pPr>
-      <w:bookmarkStart w:id="37" w:name="proprietà-dei-dati-personali"/>
+      <w:bookmarkStart w:id="39" w:name="proprietà-dei-dati-personali"/>
       <w:r>
         <w:t xml:space="preserve">6.3 Proprietà dei dati personali</w:t>
       </w:r>
-      <w:bookmarkEnd w:id="37"/>
+      <w:bookmarkEnd w:id="39"/>
     </w:p>
     <w:p>
       <w:pPr>
@@ -1345,18 +1621,228 @@
       <w:pPr>
         <w:pStyle w:val="Heading3"/>
       </w:pPr>
-      <w:bookmarkStart w:id="38" w:name="diritti-degli-interessati"/>
-      <w:r>
-        <w:t xml:space="preserve">6.4 Diritti degli interessati</w:t>
-      </w:r>
-      <w:bookmarkEnd w:id="38"/>
+      <w:bookmarkStart w:id="40" w:name="Xe9f3218c36339e2c729cd0fb866c3410c2d5766"/>
+      <w:r>
+        <w:t xml:space="preserve">6.4 Diritti degli interessati e perimetro della cancellazione</w:t>
+      </w:r>
+      <w:bookmarkEnd w:id="40"/>
     </w:p>
     <w:p>
       <w:pPr>
         <w:pStyle w:val="FirstParagraph"/>
       </w:pPr>
       <w:r>
-        <w:t xml:space="preserve">In ogni momento l’Autore può esercitare i diritti previsti dagli articoli 15-22 del GDPR (accesso, rettifica, cancellazione, limitazione, portabilità, opposizione) scrivendo ai recapiti del Titolare (CAI) o del Responsabile (Montagna Servizi) indicati in apertura del documento. La cancellazione di una fotografia comporta la rimozione del file dallo storage e del relativo record dal database; le copie già diffuse a terzi in licenza CC BY 4.0 prima della cancellazione non sono richiamabili, in conformità con la natura della licenza pubblica accettata dall’Autore al momento del caricamento.</w:t>
+        <w:t xml:space="preserve">L’Autore può esercitare i diritti previsti dagli articoli 15-22 del GDPR (accesso, rettifica, cancellazione, limitazione, portabilità, opposizione)</w:t>
+      </w:r>
+      <w:r>
+        <w:t xml:space="preserve"> </w:t>
+      </w:r>
+      <w:r>
+        <w:rPr>
+          <w:b/>
+        </w:rPr>
+        <w:t xml:space="preserve">esclusivamente sui propri dati personali</w:t>
+      </w:r>
+      <w:r>
+        <w:t xml:space="preserve"> </w:t>
+      </w:r>
+      <w:r>
+        <w:t xml:space="preserve">(cfr. § 3.1: nome, cognome, email, dati anagrafici relativi al CAI, consensi), scrivendo ai recapiti del Titolare (CAI) o del Responsabile (Montagna Servizi) indicati in apertura del documento.</w:t>
+      </w:r>
+    </w:p>
+    <w:p>
+      <w:pPr>
+        <w:pStyle w:val="BodyText"/>
+      </w:pPr>
+      <w:r>
+        <w:t xml:space="preserve">Coerentemente con la cessione dei diritti d’uso e con la qualificazione dei dati operata al § 3, è importante distinguere tre piani:</w:t>
+      </w:r>
+    </w:p>
+    <w:p>
+      <w:pPr>
+        <w:numPr>
+          <w:ilvl w:val="0"/>
+          <w:numId w:val="1007"/>
+        </w:numPr>
+        <w:pStyle w:val="Compact"/>
+      </w:pPr>
+      <w:r>
+        <w:rPr>
+          <w:b/>
+        </w:rPr>
+        <w:t xml:space="preserve">Piano dei dati personali dell’Autore (GDPR — sempre revocabili).</w:t>
+      </w:r>
+      <w:r>
+        <w:t xml:space="preserve"> </w:t>
+      </w:r>
+      <w:r>
+        <w:t xml:space="preserve">L’Autore può richiedere in qualsiasi momento accesso, rettifica, cancellazione, limitazione, portabilità o opposizione sui propri dati anagrafici e di contatto. Su richiesta il sistema rimuove anche l’attribuzione del nome dell’Autore dalle pagine pubbliche delle relative fotografie, sostituendola con una dicitura anonima.</w:t>
+      </w:r>
+    </w:p>
+    <w:p>
+      <w:pPr>
+        <w:numPr>
+          <w:ilvl w:val="0"/>
+          <w:numId w:val="1007"/>
+        </w:numPr>
+        <w:pStyle w:val="Compact"/>
+      </w:pPr>
+      <w:r>
+        <w:rPr>
+          <w:b/>
+        </w:rPr>
+        <w:t xml:space="preserve">Piano dei dati intrinseci delle Opere (cfr. § 3.2 — non revocabili).</w:t>
+      </w:r>
+      <w:r>
+        <w:t xml:space="preserve"> </w:t>
+      </w:r>
+      <w:r>
+        <w:t xml:space="preserve">Coordinate GPS, data di scatto, regione, provincia, comune, tappa SICAI, titolo e descrizione, file immagine sono parte integrante dell’Opera fotografica ceduta al CAI: non sono qualificabili come dati personali soggetti a cancellazione GDPR, e l’Autore non può richiederne la rimozione, la modifica del posizionamento o il ritiro dalla piattaforma.</w:t>
+      </w:r>
+    </w:p>
+    <w:p>
+      <w:pPr>
+        <w:numPr>
+          <w:ilvl w:val="0"/>
+          <w:numId w:val="1007"/>
+        </w:numPr>
+        <w:pStyle w:val="Compact"/>
+      </w:pPr>
+      <w:r>
+        <w:rPr>
+          <w:b/>
+        </w:rPr>
+        <w:t xml:space="preserve">Piano della concessione dei diritti d’uso sulle Opere (irrevocabile).</w:t>
+      </w:r>
+      <w:r>
+        <w:t xml:space="preserve"> </w:t>
+      </w:r>
+      <w:r>
+        <w:t xml:space="preserve">Come specificato al § 6.1, la concessione dei diritti d’uso al CAI è irrevocabile: l’Autore non può ritirarla né condizionarla successivamente al caricamento e alla validazione. Le copie già acquisite da terzi in licenza CC BY 4.0 prima dell’eventuale rimozione dalla piattaforma non sono richiamabili.</w:t>
+      </w:r>
+    </w:p>
+    <w:p>
+      <w:pPr>
+        <w:pStyle w:val="FirstParagraph"/>
+      </w:pPr>
+      <w:r>
+        <w:t xml:space="preserve">A tutela dell’Autore, la procedura di</w:t>
+      </w:r>
+      <w:r>
+        <w:t xml:space="preserve"> </w:t>
+      </w:r>
+      <w:r>
+        <w:rPr>
+          <w:b/>
+        </w:rPr>
+        <w:t xml:space="preserve">validazione amministrativa</w:t>
+      </w:r>
+      <w:r>
+        <w:t xml:space="preserve"> </w:t>
+      </w:r>
+      <w:r>
+        <w:t xml:space="preserve">(cfr. § 4.7) consente di intercettare e scartare a monte fotografie inviate per errore o non idonee, prima della loro pubblicazione e della loro entrata definitiva nel patrimonio del CAI. Una volta validata e pubblicata la foto, l’unica via per la sua rimozione è una decisione del CAI in qualità di proprietario del patrimonio.</w:t>
+      </w:r>
+    </w:p>
+    <w:p>
+      <w:pPr>
+        <w:pStyle w:val="Heading3"/>
+      </w:pPr>
+      <w:bookmarkStart w:id="41" w:name="Xa0b3353daf17adbec89f6243a2711769fb28e71"/>
+      <w:r>
+        <w:t xml:space="preserve">6.5 Discrezionalità del CAI sulla pubblicazione e sull’uso delle Opere</w:t>
+      </w:r>
+      <w:bookmarkEnd w:id="41"/>
+    </w:p>
+    <w:p>
+      <w:pPr>
+        <w:pStyle w:val="FirstParagraph"/>
+      </w:pPr>
+      <w:r>
+        <w:t xml:space="preserve">Il CAI conserva piena discrezionalità sulle Opere caricate dagli Autori, in qualità di proprietario del patrimonio iconografico FotoSICAI. In particolare:</w:t>
+      </w:r>
+    </w:p>
+    <w:p>
+      <w:pPr>
+        <w:numPr>
+          <w:ilvl w:val="0"/>
+          <w:numId w:val="1008"/>
+        </w:numPr>
+        <w:pStyle w:val="Compact"/>
+      </w:pPr>
+      <w:r>
+        <w:rPr>
+          <w:b/>
+        </w:rPr>
+        <w:t xml:space="preserve">Nessun obbligo di pubblicazione.</w:t>
+      </w:r>
+      <w:r>
+        <w:t xml:space="preserve"> </w:t>
+      </w:r>
+      <w:r>
+        <w:t xml:space="preserve">Il CAI non è obbligato a pubblicare le fotografie caricate. La validazione amministrativa (§ 4.7) è un atto discrezionale: il CAI o il soggetto attuatore da esso designato possono decidere di non pubblicare un’Opera, senza obbligo di motivazione e senza che da ciò sorga alcun diritto in capo all’Autore.</w:t>
+      </w:r>
+    </w:p>
+    <w:p>
+      <w:pPr>
+        <w:numPr>
+          <w:ilvl w:val="0"/>
+          <w:numId w:val="1008"/>
+        </w:numPr>
+        <w:pStyle w:val="Compact"/>
+      </w:pPr>
+      <w:r>
+        <w:rPr>
+          <w:b/>
+        </w:rPr>
+        <w:t xml:space="preserve">Diritto di rimozione in qualsiasi momento.</w:t>
+      </w:r>
+      <w:r>
+        <w:t xml:space="preserve"> </w:t>
+      </w:r>
+      <w:r>
+        <w:t xml:space="preserve">Anche dopo la pubblicazione, il CAI può rimuovere un’Opera dalla piattaforma, non utilizzarla, cessarne l’uso o limitarne la diffusione, a propria insindacabile discrezione e senza obbligo di preavviso o di motivazione.</w:t>
+      </w:r>
+    </w:p>
+    <w:p>
+      <w:pPr>
+        <w:numPr>
+          <w:ilvl w:val="0"/>
+          <w:numId w:val="1008"/>
+        </w:numPr>
+        <w:pStyle w:val="Compact"/>
+      </w:pPr>
+      <w:r>
+        <w:rPr>
+          <w:b/>
+        </w:rPr>
+        <w:t xml:space="preserve">Libertà di destinazione.</w:t>
+      </w:r>
+      <w:r>
+        <w:t xml:space="preserve"> </w:t>
+      </w:r>
+      <w:r>
+        <w:t xml:space="preserve">Il CAI può decidere come, dove e quando utilizzare le Opere ammesse al patrimonio, scegliendo i canali, i formati, le modalità di diffusione e l’eventuale messa a disposizione di soggetti terzi, nel rispetto delle clausole del documento di consenso.</w:t>
+      </w:r>
+    </w:p>
+    <w:p>
+      <w:pPr>
+        <w:pStyle w:val="FirstParagraph"/>
+      </w:pPr>
+      <w:r>
+        <w:t xml:space="preserve">La mancata pubblicazione, la rimozione, la rinuncia all’uso o qualunque altra decisione del CAI in merito al destino delle Opere non danno luogo ad alcun rimborso, indennizzo o pretesa da parte dell’Autore. Tale discrezionalità è formalmente esposta all’Autore al momento dell’accettazione del consenso (cfr. § 4 del documento</w:t>
+      </w:r>
+      <w:r>
+        <w:t xml:space="preserve"> </w:t>
+      </w:r>
+      <w:r>
+        <w:rPr>
+          <w:rStyle w:val="VerbatimChar"/>
+        </w:rPr>
+        <w:t xml:space="preserve">legal/consenso.md</w:t>
+      </w:r>
+      <w:r>
+        <w:t xml:space="preserve">).</w:t>
       </w:r>
     </w:p>
     <w:p>
@@ -1370,17 +1856,17 @@
       <w:pPr>
         <w:pStyle w:val="Heading2"/>
       </w:pPr>
-      <w:bookmarkStart w:id="39" w:name="misure-di-sicurezza"/>
+      <w:bookmarkStart w:id="42" w:name="misure-di-sicurezza"/>
       <w:r>
         <w:t xml:space="preserve">7. Misure di sicurezza</w:t>
       </w:r>
-      <w:bookmarkEnd w:id="39"/>
-    </w:p>
-    <w:p>
-      <w:pPr>
-        <w:numPr>
-          <w:ilvl w:val="0"/>
-          <w:numId w:val="1007"/>
+      <w:bookmarkEnd w:id="42"/>
+    </w:p>
+    <w:p>
+      <w:pPr>
+        <w:numPr>
+          <w:ilvl w:val="0"/>
+          <w:numId w:val="1009"/>
         </w:numPr>
         <w:pStyle w:val="Compact"/>
       </w:pPr>
@@ -1404,7 +1890,7 @@
       <w:pPr>
         <w:numPr>
           <w:ilvl w:val="0"/>
-          <w:numId w:val="1007"/>
+          <w:numId w:val="1009"/>
         </w:numPr>
         <w:pStyle w:val="Compact"/>
       </w:pPr>
@@ -1416,7 +1902,7 @@
       <w:pPr>
         <w:numPr>
           <w:ilvl w:val="0"/>
-          <w:numId w:val="1007"/>
+          <w:numId w:val="1009"/>
         </w:numPr>
         <w:pStyle w:val="Compact"/>
       </w:pPr>
@@ -1428,7 +1914,7 @@
       <w:pPr>
         <w:numPr>
           <w:ilvl w:val="0"/>
-          <w:numId w:val="1007"/>
+          <w:numId w:val="1009"/>
         </w:numPr>
         <w:pStyle w:val="Compact"/>
       </w:pPr>
@@ -1458,7 +1944,7 @@
       <w:pPr>
         <w:numPr>
           <w:ilvl w:val="0"/>
-          <w:numId w:val="1007"/>
+          <w:numId w:val="1009"/>
         </w:numPr>
         <w:pStyle w:val="Compact"/>
       </w:pPr>
@@ -1470,7 +1956,7 @@
       <w:pPr>
         <w:numPr>
           <w:ilvl w:val="0"/>
-          <w:numId w:val="1007"/>
+          <w:numId w:val="1009"/>
         </w:numPr>
         <w:pStyle w:val="Compact"/>
       </w:pPr>
@@ -1489,18 +1975,273 @@
       <w:pPr>
         <w:pStyle w:val="Heading2"/>
       </w:pPr>
-      <w:bookmarkStart w:id="40" w:name="conservazione-dei-dati"/>
+      <w:bookmarkStart w:id="43" w:name="conservazione-dei-dati"/>
       <w:r>
         <w:t xml:space="preserve">8. Conservazione dei dati</w:t>
       </w:r>
-      <w:bookmarkEnd w:id="40"/>
+      <w:bookmarkEnd w:id="43"/>
     </w:p>
     <w:p>
       <w:pPr>
         <w:pStyle w:val="FirstParagraph"/>
       </w:pPr>
       <w:r>
-        <w:t xml:space="preserve">I dati personali sono conservati per tutta la durata del progetto FotoSICAI e dell’incarico di Montagna Servizi per il SICAI. Alla cessazione del rapporto, il CAI in qualità di Titolare deciderà se proseguire il trattamento direttamente o per il tramite di altro soggetto attuatore. In caso di interruzione del progetto, i dati saranno conservati per il tempo strettamente necessario all’archiviazione storica del patrimonio fotografico, ferma restando la possibilità per gli Autori di richiederne la cancellazione individuale.</w:t>
+        <w:t xml:space="preserve">I</w:t>
+      </w:r>
+      <w:r>
+        <w:t xml:space="preserve"> </w:t>
+      </w:r>
+      <w:r>
+        <w:rPr>
+          <w:b/>
+        </w:rPr>
+        <w:t xml:space="preserve">dati personali dell’Autore</w:t>
+      </w:r>
+      <w:r>
+        <w:t xml:space="preserve"> </w:t>
+      </w:r>
+      <w:r>
+        <w:t xml:space="preserve">(cfr. § 3.1) sono conservati per tutta la durata del progetto FotoSICAI e del contratto affidato a Montagna Servizi (CIG B165634123, 2024-2026), salvo richiesta di cancellazione anticipata da parte dell’interessato ai sensi del GDPR. Alla cessazione del rapporto contrattuale, il CAI in qualità di Titolare deciderà se proseguire il trattamento direttamente o per il tramite di altro soggetto attuatore.</w:t>
+      </w:r>
+    </w:p>
+    <w:p>
+      <w:pPr>
+        <w:pStyle w:val="BodyText"/>
+      </w:pPr>
+      <w:r>
+        <w:t xml:space="preserve">I</w:t>
+      </w:r>
+      <w:r>
+        <w:t xml:space="preserve"> </w:t>
+      </w:r>
+      <w:r>
+        <w:rPr>
+          <w:b/>
+        </w:rPr>
+        <w:t xml:space="preserve">dati delle Opere</w:t>
+      </w:r>
+      <w:r>
+        <w:t xml:space="preserve"> </w:t>
+      </w:r>
+      <w:r>
+        <w:t xml:space="preserve">(cfr. § 3.2: file immagine e metadati intrinseci) sono invece parte del patrimonio iconografico ceduto al CAI in modo irrevocabile e sono conservati a tempo indeterminato, salvo decisioni del CAI in qualità di proprietario. Tale conservazione non è soggetta alle richieste di cancellazione GDPR dell’Autore, in coerenza con quanto descritto ai § 3.2 e § 6.4.</w:t>
+      </w:r>
+    </w:p>
+    <w:p>
+      <w:r>
+        <w:pict>
+          <v:rect style="width:0;height:1.5pt" o:hralign="center" o:hrstd="t" o:hr="t"/>
+        </w:pict>
+      </w:r>
+    </w:p>
+    <w:p>
+      <w:pPr>
+        <w:pStyle w:val="Heading2"/>
+      </w:pPr>
+      <w:bookmarkStart w:id="44" w:name="Xadb5c37213a00135b9671406ac35312dc1986e4"/>
+      <w:r>
+        <w:t xml:space="preserve">9. Impegni di Montagna Servizi alla cessazione del contratto</w:t>
+      </w:r>
+      <w:bookmarkEnd w:id="44"/>
+    </w:p>
+    <w:p>
+      <w:pPr>
+        <w:pStyle w:val="FirstParagraph"/>
+      </w:pPr>
+      <w:r>
+        <w:t xml:space="preserve">L’incarico affidato a Montagna Servizi S.C.p.A. nell’ambito del</w:t>
+      </w:r>
+      <w:r>
+        <w:t xml:space="preserve"> </w:t>
+      </w:r>
+      <w:r>
+        <w:rPr>
+          <w:b/>
+        </w:rPr>
+        <w:t xml:space="preserve">Piano Progetto Sentiero Italia CAI (CIG B165634123, 2024-2026)</w:t>
+      </w:r>
+      <w:r>
+        <w:t xml:space="preserve"> </w:t>
+      </w:r>
+      <w:r>
+        <w:t xml:space="preserve">ha durata limitata. Alla scadenza naturale del contratto o in caso di sua anticipata cessazione per qualsiasi causa, Montagna Servizi si impegna formalmente a:</w:t>
+      </w:r>
+    </w:p>
+    <w:p>
+      <w:pPr>
+        <w:numPr>
+          <w:ilvl w:val="0"/>
+          <w:numId w:val="1010"/>
+        </w:numPr>
+        <w:pStyle w:val="Compact"/>
+      </w:pPr>
+      <w:r>
+        <w:rPr>
+          <w:b/>
+        </w:rPr>
+        <w:t xml:space="preserve">cedere al CAI l’intero patrimonio digitale</w:t>
+      </w:r>
+      <w:r>
+        <w:t xml:space="preserve"> </w:t>
+      </w:r>
+      <w:r>
+        <w:t xml:space="preserve">raccolto tramite la piattaforma FotoSICAI — fotografie originali in tutte le risoluzioni, database SQLite o suo equivalente in formato standard, metadati, indicizzazioni per tappa SICAI, log di consenso, log di verifica email e log di validazione amministrativa — in formato aperto e riutilizzabile, accompagnato dalla documentazione tecnica necessaria al subentro;</w:t>
+      </w:r>
+    </w:p>
+    <w:p>
+      <w:pPr>
+        <w:numPr>
+          <w:ilvl w:val="0"/>
+          <w:numId w:val="1010"/>
+        </w:numPr>
+        <w:pStyle w:val="Compact"/>
+      </w:pPr>
+      <w:r>
+        <w:rPr>
+          <w:b/>
+        </w:rPr>
+        <w:t xml:space="preserve">rimuovere ogni riferimento al Club Alpino Italiano e al Sentiero Italia CAI</w:t>
+      </w:r>
+      <w:r>
+        <w:t xml:space="preserve"> </w:t>
+      </w:r>
+      <w:r>
+        <w:t xml:space="preserve">dalla piattaforma FotoSICAI, dai propri canali di comunicazione (sito istituzionale, social media, materiali promozionali) e dai propri prodotti commerciali, fatta salva la sola documentazione contrattuale che la legge richiede di conservare;</w:t>
+      </w:r>
+    </w:p>
+    <w:p>
+      <w:pPr>
+        <w:numPr>
+          <w:ilvl w:val="0"/>
+          <w:numId w:val="1010"/>
+        </w:numPr>
+        <w:pStyle w:val="Compact"/>
+      </w:pPr>
+      <w:r>
+        <w:rPr>
+          <w:b/>
+        </w:rPr>
+        <w:t xml:space="preserve">disattivare il dominio</w:t>
+      </w:r>
+      <w:r>
+        <w:rPr>
+          <w:b/>
+        </w:rPr>
+        <w:t xml:space="preserve"> </w:t>
+      </w:r>
+      <w:r>
+        <w:rPr>
+          <w:rStyle w:val="VerbatimChar"/>
+          <w:b/>
+        </w:rPr>
+        <w:t xml:space="preserve">fotosicai.montagnaservizi.it</w:t>
+      </w:r>
+      <w:r>
+        <w:t xml:space="preserve"> </w:t>
+      </w:r>
+      <w:r>
+        <w:t xml:space="preserve">e gli endpoint pubblici della piattaforma, oppure trasferire dominio e infrastruttura al soggetto indicato dal CAI;</w:t>
+      </w:r>
+    </w:p>
+    <w:p>
+      <w:pPr>
+        <w:numPr>
+          <w:ilvl w:val="0"/>
+          <w:numId w:val="1010"/>
+        </w:numPr>
+        <w:pStyle w:val="Compact"/>
+      </w:pPr>
+      <w:r>
+        <w:rPr>
+          <w:b/>
+        </w:rPr>
+        <w:t xml:space="preserve">non utilizzare più la piattaforma FotoSICAI</w:t>
+      </w:r>
+      <w:r>
+        <w:t xml:space="preserve"> </w:t>
+      </w:r>
+      <w:r>
+        <w:t xml:space="preserve">né le sue componenti tecniche (codice sorgente, database, modelli AI configurati)</w:t>
+      </w:r>
+      <w:r>
+        <w:t xml:space="preserve"> </w:t>
+      </w:r>
+      <w:r>
+        <w:rPr>
+          <w:b/>
+        </w:rPr>
+        <w:t xml:space="preserve">per la raccolta di fotografie del Sentiero Italia CAI</w:t>
+      </w:r>
+      <w:r>
+        <w:t xml:space="preserve">, salvo nuovo accordo formale con il CAI stesso;</w:t>
+      </w:r>
+    </w:p>
+    <w:p>
+      <w:pPr>
+        <w:numPr>
+          <w:ilvl w:val="0"/>
+          <w:numId w:val="1010"/>
+        </w:numPr>
+        <w:pStyle w:val="Compact"/>
+      </w:pPr>
+      <w:r>
+        <w:rPr>
+          <w:b/>
+        </w:rPr>
+        <w:t xml:space="preserve">non rivendicare alcun diritto d’uso esclusivo</w:t>
+      </w:r>
+      <w:r>
+        <w:t xml:space="preserve"> </w:t>
+      </w:r>
+      <w:r>
+        <w:t xml:space="preserve">sulle Opere caricate dagli Autori né sul patrimonio iconografico complessivo, che resta in proprietà del CAI ai sensi del documento di consenso accettato dagli Autori;</w:t>
+      </w:r>
+    </w:p>
+    <w:p>
+      <w:pPr>
+        <w:numPr>
+          <w:ilvl w:val="0"/>
+          <w:numId w:val="1010"/>
+        </w:numPr>
+        <w:pStyle w:val="Compact"/>
+      </w:pPr>
+      <w:r>
+        <w:t xml:space="preserve">garantire la</w:t>
+      </w:r>
+      <w:r>
+        <w:t xml:space="preserve"> </w:t>
+      </w:r>
+      <w:r>
+        <w:rPr>
+          <w:b/>
+        </w:rPr>
+        <w:t xml:space="preserve">continuità operativa minima per gli Autori</w:t>
+      </w:r>
+      <w:r>
+        <w:t xml:space="preserve"> </w:t>
+      </w:r>
+      <w:r>
+        <w:t xml:space="preserve">(in particolare la possibilità di esercitare i diritti GDPR) per un periodo congruo di transizione concordato con il CAI.</w:t>
+      </w:r>
+    </w:p>
+    <w:p>
+      <w:pPr>
+        <w:pStyle w:val="FirstParagraph"/>
+      </w:pPr>
+      <w:r>
+        <w:t xml:space="preserve">Tali impegni — recepiti formalmente anche nel testo del documento di consenso accettato dagli Autori (cfr.</w:t>
+      </w:r>
+      <w:r>
+        <w:t xml:space="preserve"> </w:t>
+      </w:r>
+      <w:r>
+        <w:rPr>
+          <w:rStyle w:val="VerbatimChar"/>
+        </w:rPr>
+        <w:t xml:space="preserve">legal/consenso.md</w:t>
+      </w:r>
+      <w:r>
+        <w:t xml:space="preserve">, § 7) — costituiscono parte integrante del rapporto fra Montagna Servizi, il CAI e gli Autori, e garantiscono la continuità del progetto FotoSICAI in capo al CAI anche oltre la durata del contratto attuale.</w:t>
       </w:r>
     </w:p>
     <w:p>
@@ -2160,6 +2901,15 @@
     <w:abstractNumId w:val="991"/>
   </w:num>
   <w:num w:numId="1007">
+    <w:abstractNumId w:val="991"/>
+  </w:num>
+  <w:num w:numId="1008">
+    <w:abstractNumId w:val="991"/>
+  </w:num>
+  <w:num w:numId="1009">
+    <w:abstractNumId w:val="991"/>
+  </w:num>
+  <w:num w:numId="1010">
     <w:abstractNumId w:val="991"/>
   </w:num>
 </w:numbering>

</xml_diff>